<commit_message>
docs: integrate high-quality AI-generated DFD/ERD diagrams and align document layouts
</commit_message>
<xml_diff>
--- a/Car_Rental_IET_Report_Compiled.docx
+++ b/Car_Rental_IET_Report_Compiled.docx
@@ -3342,7 +3342,7 @@
       <w:r>
         <w:drawing>
           <wp:inline xmlns:a="http://schemas.openxmlformats.org/drawingml/2006/main" xmlns:pic="http://schemas.openxmlformats.org/drawingml/2006/picture">
-            <wp:extent cx="5303520" cy="1988820"/>
+            <wp:extent cx="5303520" cy="5303520"/>
             <wp:docPr id="4" name="Picture 4"/>
             <wp:cNvGraphicFramePr>
               <a:graphicFrameLocks noChangeAspect="1"/>
@@ -3363,7 +3363,7 @@
                   <pic:spPr>
                     <a:xfrm>
                       <a:off x="0" y="0"/>
-                      <a:ext cx="5303520" cy="1988820"/>
+                      <a:ext cx="5303520" cy="5303520"/>
                     </a:xfrm>
                     <a:prstGeom prst="rect"/>
                   </pic:spPr>
@@ -3411,7 +3411,7 @@
       <w:r>
         <w:drawing>
           <wp:inline xmlns:a="http://schemas.openxmlformats.org/drawingml/2006/main" xmlns:pic="http://schemas.openxmlformats.org/drawingml/2006/picture">
-            <wp:extent cx="5303520" cy="2983230"/>
+            <wp:extent cx="5303520" cy="5303520"/>
             <wp:docPr id="5" name="Picture 5"/>
             <wp:cNvGraphicFramePr>
               <a:graphicFrameLocks noChangeAspect="1"/>
@@ -3432,7 +3432,7 @@
                   <pic:spPr>
                     <a:xfrm>
                       <a:off x="0" y="0"/>
-                      <a:ext cx="5303520" cy="2983230"/>
+                      <a:ext cx="5303520" cy="5303520"/>
                     </a:xfrm>
                     <a:prstGeom prst="rect"/>
                   </pic:spPr>
@@ -3480,7 +3480,7 @@
       <w:r>
         <w:drawing>
           <wp:inline xmlns:a="http://schemas.openxmlformats.org/drawingml/2006/main" xmlns:pic="http://schemas.openxmlformats.org/drawingml/2006/picture">
-            <wp:extent cx="5303520" cy="2651760"/>
+            <wp:extent cx="5303520" cy="5303520"/>
             <wp:docPr id="6" name="Picture 6"/>
             <wp:cNvGraphicFramePr>
               <a:graphicFrameLocks noChangeAspect="1"/>
@@ -3501,7 +3501,7 @@
                   <pic:spPr>
                     <a:xfrm>
                       <a:off x="0" y="0"/>
-                      <a:ext cx="5303520" cy="2651760"/>
+                      <a:ext cx="5303520" cy="5303520"/>
                     </a:xfrm>
                     <a:prstGeom prst="rect"/>
                   </pic:spPr>
@@ -3549,7 +3549,7 @@
       <w:r>
         <w:drawing>
           <wp:inline xmlns:a="http://schemas.openxmlformats.org/drawingml/2006/main" xmlns:pic="http://schemas.openxmlformats.org/drawingml/2006/picture">
-            <wp:extent cx="5303520" cy="2320290"/>
+            <wp:extent cx="5303520" cy="5303520"/>
             <wp:docPr id="7" name="Picture 7"/>
             <wp:cNvGraphicFramePr>
               <a:graphicFrameLocks noChangeAspect="1"/>
@@ -3570,7 +3570,7 @@
                   <pic:spPr>
                     <a:xfrm>
                       <a:off x="0" y="0"/>
-                      <a:ext cx="5303520" cy="2320290"/>
+                      <a:ext cx="5303520" cy="5303520"/>
                     </a:xfrm>
                     <a:prstGeom prst="rect"/>
                   </pic:spPr>
@@ -3618,7 +3618,7 @@
       <w:r>
         <w:drawing>
           <wp:inline xmlns:a="http://schemas.openxmlformats.org/drawingml/2006/main" xmlns:pic="http://schemas.openxmlformats.org/drawingml/2006/picture">
-            <wp:extent cx="5303520" cy="2320290"/>
+            <wp:extent cx="5303520" cy="5303520"/>
             <wp:docPr id="8" name="Picture 8"/>
             <wp:cNvGraphicFramePr>
               <a:graphicFrameLocks noChangeAspect="1"/>
@@ -3639,7 +3639,7 @@
                   <pic:spPr>
                     <a:xfrm>
                       <a:off x="0" y="0"/>
-                      <a:ext cx="5303520" cy="2320290"/>
+                      <a:ext cx="5303520" cy="5303520"/>
                     </a:xfrm>
                     <a:prstGeom prst="rect"/>
                   </pic:spPr>

</xml_diff>